<commit_message>
Longhand and shorthand sets: label as optional practice, no score box
Co-Authored-By: Claude Sonnet 5.5 <noreply@anthropic.com>
Claude-Session: https://claude.ai/code/session_01LaT1EarAMnh5opQoFahNzN
</commit_message>
<xml_diff>
--- a/output/chem-u02/SHULL_CHEM_Practice_Set_U02_S02.3_Longhand.docx
+++ b/output/chem-u02/SHULL_CHEM_Practice_Set_U02_S02.3_Longhand.docx
@@ -62,7 +62,7 @@
                 <w:sz w:val="14"/>
                 <w:spacing w:val="26"/>
               </w:rPr>
-              <w:t>PRACTICE SET  ·  ELECTRON CONFIGURATIONS  ·  LONGHAND</w:t>
+              <w:t>OPTIONAL PRACTICE  ·  ELECTRON CONFIGURATIONS  ·  LONGHAND</w:t>
             </w:r>
           </w:p>
         </w:tc>
@@ -76,10 +76,9 @@
         <w:tblLayout w:type="fixed"/>
       </w:tblPr>
       <w:tblGrid>
-        <w:gridCol w:w="4752"/>
+        <w:gridCol w:w="6912"/>
         <w:gridCol w:w="2160"/>
         <w:gridCol w:w="1728"/>
-        <w:gridCol w:w="2160"/>
       </w:tblGrid>
       <w:tr>
         <w:trPr>
@@ -88,7 +87,7 @@
         </w:trPr>
         <w:tc>
           <w:tcPr>
-            <w:tcW w:type="dxa" w:w="4752"/>
+            <w:tcW w:type="dxa" w:w="6912"/>
             <w:vAlign w:val="top"/>
             <w:tcMar>
               <w:top w:w="20" w:type="dxa"/>
@@ -173,36 +172,6 @@
                 <w:u w:val="none"/>
               </w:rPr>
               <w:t>PERIOD</w:t>
-            </w:r>
-          </w:p>
-        </w:tc>
-        <w:tc>
-          <w:tcPr>
-            <w:tcW w:type="dxa" w:w="2160"/>
-            <w:vAlign w:val="top"/>
-            <w:tcMar>
-              <w:top w:w="20" w:type="dxa"/>
-              <w:left w:w="0" w:type="dxa"/>
-              <w:bottom w:w="0" w:type="dxa"/>
-              <w:right w:w="120" w:type="dxa"/>
-            </w:tcMar>
-            <w:tcBorders>
-              <w:bottom w:val="single" w:sz="8" w:color="C8CDC2"/>
-            </w:tcBorders>
-          </w:tcPr>
-          <w:p>
-            <w:pPr>
-              <w:spacing w:after="0"/>
-            </w:pPr>
-            <w:r>
-              <w:rPr>
-                <w:rFonts w:ascii="Trade Gothic Next" w:hAnsi="Trade Gothic Next"/>
-                <w:b/>
-                <w:color w:val="55604F"/>
-                <w:sz w:val="15"/>
-                <w:u w:val="none"/>
-              </w:rPr>
-              <w:t>SCORE  / 5</w:t>
             </w:r>
           </w:p>
         </w:tc>

</xml_diff>